<commit_message>
EP polish: Zach Geisendorfer prep — fix timeline, sharpen the comeback arc
Stress test caught a factual error: the team growth/collapse predates his first
KIR appearance (GRIT ep aired 9/4/2024), so it can't be framed as concurrent with
the open-house era. Rebuilt the spine around the real rise-fall-rise: ~5 -> ~40
agents (+25 in two weeks) -> collapsed back to ~6 -> rebuilt from the ground up.
Updated cold open, titles, Act 1 questions, rapid fire, and research brief.

Co-Authored-By: Claude Opus 4.8 (1M context) <noreply@anthropic.com>
</commit_message>
<xml_diff>
--- a/guest-prep/Zach_Geisendorfer_Interview_Prep.docx
+++ b/guest-prep/Zach_Geisendorfer_Interview_Prep.docx
@@ -179,14 +179,14 @@
           <w:szCs w:val="21"/>
           <w:color w:val="1F3864"/>
         </w:rPr>
-        <w:t xml:space="preserve">The growth story (NEW): </w:t>
-      </w:r>
-      <w:r>
-        <w:rPr>
-          <w:sz w:val="21"/>
-          <w:szCs w:val="21"/>
-        </w:rPr>
-        <w:t xml:space="preserve">FAM grew from ~5 agents to ~40 in roughly a year in Orange County — and it nearly came apart. Featured on the GRIT podcast (Sisu), Ep. 145: “When Growth Hurts: How Zach Geisendorfer Recovered From Rapid Expansion.” This is the fresh core.</w:t>
+        <w:t xml:space="preserve">The growth story (NEW core — rise/fall/rise): </w:t>
+      </w:r>
+      <w:r>
+        <w:rPr>
+          <w:sz w:val="21"/>
+          <w:szCs w:val="21"/>
+        </w:rPr>
+        <w:t xml:space="preserve">In Orange County, FAM grew from ~5 agents to nearly 40 — at one point adding ~25 agents in TWO WEEKS — then it collapsed all the way back to ~6 because they had no tracking, accountability, or replicable process. They rebuilt from the ground up into the team he runs today. Told on the GRIT podcast (Sisu), Ep. 145, “When Growth Hurts” (aired 9/4/2024). NOTE: this is BACKSTORY that predates his first KIR appearance — do NOT frame it as concurrent with the open-house era.</w:t>
       </w:r>
     </w:p>
     <w:p>
@@ -333,7 +333,7 @@
           <w:sz w:val="22"/>
           <w:szCs w:val="22"/>
         </w:rPr>
-        <w:t xml:space="preserve">What actually breaks when you grow a team fast — and the systems and culture that keep it from blowing up. Zach scaled 5→40 agents in a year, hit the wall, and rebuilt. This is the story behind the open-house highlight reel.</w:t>
+        <w:t xml:space="preserve">The comeback nobody on this show has heard. Zach helped scale a team to ~40 agents (adding ~25 in two weeks), watched it collapse back to ~6, and rebuilt it on systems and culture. What actually breaks when you grow too fast — and how you rebuild. The open-house machine is part of how he came back.</w:t>
       </w:r>
     </w:p>
     <w:p>
@@ -473,7 +473,7 @@
           <w:szCs w:val="22"/>
           <w:color w:val="2E5496"/>
         </w:rPr>
-        <w:t xml:space="preserve">The “I’ve interviewed hundreds” moment (use once):</w:t>
+        <w:t xml:space="preserve">The “I’ve interviewed hundreds” moment (use once, in Act 1 Q7):</w:t>
       </w:r>
     </w:p>
     <w:p>
@@ -487,7 +487,7 @@
           <w:szCs w:val="21"/>
           <w:color w:val="404040"/>
         </w:rPr>
-        <w:t xml:space="preserve">“I’ve interviewed hundreds of agents on this show, and almost every one of them thinks the dream is a big team. You built one fast — five to forty in about a year — and you’ve said it almost broke you. So what does nobody tell you about growing before you’re ready?”</w:t>
+        <w:t xml:space="preserve">“I’ve interviewed hundreds of agents on this show, and almost every one thinks the dream is a bigger team. You added twenty-five agents in two weeks and watched the whole thing collapse back to six. So what does nobody tell you about growing before you’re ready?”</w:t>
       </w:r>
     </w:p>
     <w:p>
@@ -534,8 +534,8 @@
       </w:tblPr>
       <w:tblGrid>
         <w:gridCol w:w="400"/>
-        <w:gridCol w:w="5600"/>
-        <w:gridCol w:w="3600"/>
+        <w:gridCol w:w="5800"/>
+        <w:gridCol w:w="3400"/>
       </w:tblGrid>
       <w:tr>
         <w:tc>
@@ -566,7 +566,7 @@
         </w:tc>
         <w:tc>
           <w:tcPr>
-            <w:tcW w:type="dxa" w:w="5600"/>
+            <w:tcW w:type="dxa" w:w="5800"/>
             <w:shd w:val="clear" w:fill="1F3864"/>
             <w:tcMar>
               <w:top w:w="60" w:type="dxa"/>
@@ -592,7 +592,7 @@
         </w:tc>
         <w:tc>
           <w:tcPr>
-            <w:tcW w:type="dxa" w:w="3600"/>
+            <w:tcW w:type="dxa" w:w="3400"/>
             <w:shd w:val="clear" w:fill="1F3864"/>
             <w:tcMar>
               <w:top w:w="60" w:type="dxa"/>
@@ -645,7 +645,7 @@
         </w:tc>
         <w:tc>
           <w:tcPr>
-            <w:tcW w:type="dxa" w:w="5600"/>
+            <w:tcW w:type="dxa" w:w="5800"/>
             <w:shd w:val="clear" w:fill="FFFFFF"/>
             <w:tcMar>
               <w:top w:w="60" w:type="dxa"/>
@@ -664,13 +664,13 @@
                 <w:szCs w:val="20"/>
                 <w:color w:val="000000"/>
               </w:rPr>
-              <w:t xml:space="preserve">When Growth Hurts: How Zach Geisendorfer Scaled From 5 to 40 Agents — and Survived It</w:t>
+              <w:t xml:space="preserve">When Growth Hurts: Zach Geisendorfer Added 25 Agents in Two Weeks — Then Watched It Collapse</w:t>
             </w:r>
           </w:p>
         </w:tc>
         <w:tc>
           <w:tcPr>
-            <w:tcW w:type="dxa" w:w="3600"/>
+            <w:tcW w:type="dxa" w:w="3400"/>
             <w:shd w:val="clear" w:fill="FFFFFF"/>
             <w:tcMar>
               <w:top w:w="60" w:type="dxa"/>
@@ -689,7 +689,7 @@
                 <w:szCs w:val="20"/>
                 <w:color w:val="000000"/>
               </w:rPr>
-              <w:t xml:space="preserve">Specific numbers + the rare “growth nearly broke me” angle. Distinct from the open-house episode.</w:t>
+              <w:t xml:space="preserve">The specific, almost unbelievable numbers do the work. Pure curiosity gap.</w:t>
             </w:r>
           </w:p>
         </w:tc>
@@ -722,7 +722,7 @@
         </w:tc>
         <w:tc>
           <w:tcPr>
-            <w:tcW w:type="dxa" w:w="5600"/>
+            <w:tcW w:type="dxa" w:w="5800"/>
             <w:shd w:val="clear" w:fill="F2F5FB"/>
             <w:tcMar>
               <w:top w:w="60" w:type="dxa"/>
@@ -741,13 +741,13 @@
                 <w:szCs w:val="20"/>
                 <w:color w:val="000000"/>
               </w:rPr>
-              <w:t xml:space="preserve">Zach Geisendorfer Is Back: The Systems That Keep a Mega Team From Falling Apart</w:t>
+              <w:t xml:space="preserve">From 40 Agents to 6 and Back: How Zach Geisendorfer Rebuilt a Team That Almost Killed Itself</w:t>
             </w:r>
           </w:p>
         </w:tc>
         <w:tc>
           <w:tcPr>
-            <w:tcW w:type="dxa" w:w="3600"/>
+            <w:tcW w:type="dxa" w:w="3400"/>
             <w:shd w:val="clear" w:fill="F2F5FB"/>
             <w:tcMar>
               <w:top w:w="60" w:type="dxa"/>
@@ -766,7 +766,7 @@
                 <w:szCs w:val="20"/>
                 <w:color w:val="000000"/>
               </w:rPr>
-              <w:t xml:space="preserve">Signals a returning fan-favorite + promises the systems layer agents crave.</w:t>
+              <w:t xml:space="preserve">The full rise-fall-rise in the title. Promises a comeback, not just a cautionary tale.</w:t>
             </w:r>
           </w:p>
         </w:tc>
@@ -799,7 +799,7 @@
         </w:tc>
         <w:tc>
           <w:tcPr>
-            <w:tcW w:type="dxa" w:w="5600"/>
+            <w:tcW w:type="dxa" w:w="5800"/>
             <w:shd w:val="clear" w:fill="FFFFFF"/>
             <w:tcMar>
               <w:top w:w="60" w:type="dxa"/>
@@ -818,13 +818,13 @@
                 <w:szCs w:val="20"/>
                 <w:color w:val="000000"/>
               </w:rPr>
-              <w:t xml:space="preserve">600,000 Cold Calls and a Team That Almost Imploded — Zach Geisendorfer on Scaling Without Burning Down</w:t>
+              <w:t xml:space="preserve">Zach Geisendorfer Is Back: The Systems That Keep a Mega Team From Falling Apart</w:t>
             </w:r>
           </w:p>
         </w:tc>
         <w:tc>
           <w:tcPr>
-            <w:tcW w:type="dxa" w:w="3600"/>
+            <w:tcW w:type="dxa" w:w="3400"/>
             <w:shd w:val="clear" w:fill="FFFFFF"/>
             <w:tcMar>
               <w:top w:w="60" w:type="dxa"/>
@@ -843,7 +843,7 @@
                 <w:szCs w:val="20"/>
                 <w:color w:val="000000"/>
               </w:rPr>
-              <w:t xml:space="preserve">Big concrete number + tension. High curiosity, clip-worthy.</w:t>
+              <w:t xml:space="preserve">Signals a returning fan-favorite + promises the systems layer agents crave.</w:t>
             </w:r>
           </w:p>
         </w:tc>
@@ -882,7 +882,31 @@
           <w:szCs w:val="21"/>
           <w:color w:val="404040"/>
         </w:rPr>
-        <w:t xml:space="preserve">“My guest today came on this show last year and taught us how to turn an open house into a money-printing machine — and a lot of you ran with it. But here’s what we didn’t get to: while he was doing that, his team went from five agents to nearly forty in about a year — and it almost came apart at the seams. Today Zach Geisendorfer is back to tell us what actually breaks when you grow fast, and the systems and culture that hold it together. Stay tuned.”</w:t>
+        <w:t xml:space="preserve">“My guest today came on this show last year and taught us how to turn an open house into a money-printing machine — and a lot of you ran with it. But here’s the part we never got to: before any of that, he helped build a real estate team from five agents to nearly forty, added twenty-five of them in a single two-week stretch, and then watched the whole thing collapse all the way back down to six. Today Zach Geisendorfer is back to tell us what actually breaks when you grow too fast — and exactly how he rebuilt a team that’s thriving today. Stay tuned.”</w:t>
+      </w:r>
+    </w:p>
+    <w:p>
+      <w:pPr>
+        <w:spacing w:before="0" w:after="80"/>
+      </w:pPr>
+      <w:r>
+        <w:rPr>
+          <w:b/>
+          <w:i/>
+          <w:sz w:val="19"/>
+          <w:szCs w:val="19"/>
+          <w:color w:val="2E5496"/>
+        </w:rPr>
+        <w:t xml:space="preserve">Safety valve: </w:t>
+      </w:r>
+      <w:r>
+        <w:rPr>
+          <w:i/>
+          <w:sz w:val="19"/>
+          <w:szCs w:val="19"/>
+          <w:color w:val="595959"/>
+        </w:rPr>
+        <w:t xml:space="preserve">The 25-in-two-weeks and collapse-to-six figures come from his GRIT episode (9/4/2024). If he frames the numbers differently, follow his version — don’t insist on yours.</w:t>
       </w:r>
     </w:p>
     <w:p>
@@ -917,7 +941,7 @@
           <w:sz w:val="21"/>
           <w:szCs w:val="21"/>
         </w:rPr>
-        <w:t xml:space="preserve">How to scale a real estate team without it imploding — the specific systems, hires, and culture moves Zach used to recover after FAM grew 5→40 in a year, told so an individual agent or a brand-new team leader can borrow it.</w:t>
+        <w:t xml:space="preserve">The rise-fall-rise of building a real estate team: how Zach helped scale to ~40 agents, watched it collapse back to ~6 for lack of systems, and rebuilt it — told so a solo agent or a brand-new team leader can borrow the lessons.</w:t>
       </w:r>
     </w:p>
     <w:p>
@@ -938,7 +962,7 @@
           <w:sz w:val="21"/>
           <w:szCs w:val="21"/>
         </w:rPr>
-        <w:t xml:space="preserve">The open-house episode gave the audience a tactic. This one gives them the business behind the tactic. It’s genuinely new ground, it’s the rare “I grew too fast and it hurt” confession (most guests only tell the highlight reel), and it serves both the solo agent dreaming of a team and the team leader already drowning.</w:t>
+        <w:t xml:space="preserve">The open-house episode gave the audience a tactic. This gives them the business behind it — and a real confession most guests never make: he grew too fast and it blew up in his hands. The comeback is what makes it land. Serves both the solo agent dreaming of a team and the leader already drowning.</w:t>
       </w:r>
     </w:p>
     <w:p>
@@ -959,7 +983,28 @@
           <w:sz w:val="21"/>
           <w:szCs w:val="21"/>
         </w:rPr>
-        <w:t xml:space="preserve">Most of the audience missed the April 2025 episode, so we open with a tight 2–3 minute callback to the open-house system (just enough to deliver value and tee up new listeners), then pivot to the growth story.</w:t>
+        <w:t xml:space="preserve">Most of the audience missed the April 2025 episode, so we open with a tight 2–3 minute callback to the open-house system (enough to deliver value and onboard new listeners), then pivot to the backstory they’ve never heard.</w:t>
+      </w:r>
+    </w:p>
+    <w:p>
+      <w:pPr>
+        <w:spacing w:before="0" w:after="60"/>
+      </w:pPr>
+      <w:r>
+        <w:rPr>
+          <w:b/>
+          <w:sz w:val="21"/>
+          <w:szCs w:val="21"/>
+          <w:color w:val="1F3864"/>
+        </w:rPr>
+        <w:t xml:space="preserve">Timeline note: </w:t>
+      </w:r>
+      <w:r>
+        <w:rPr>
+          <w:sz w:val="21"/>
+          <w:szCs w:val="21"/>
+        </w:rPr>
+        <w:t xml:space="preserve">The growth-and-collapse predates his first KIR appearance. Frame it as “the story behind the story,” not as something happening now. The “now” is the rebuilt, thriving team — land the comeback before the close.</w:t>
       </w:r>
     </w:p>
     <w:p>
@@ -1492,7 +1537,7 @@
           <w:sz w:val="21"/>
           <w:szCs w:val="21"/>
         </w:rPr>
-        <w:t xml:space="preserve">You’ve made roughly 600,000 calls. What’s the number you’re most proud of that has nothing to do with calls?</w:t>
+        <w:t xml:space="preserve">Most overrated thing agents chase?</w:t>
       </w:r>
     </w:p>
     <w:p>
@@ -1573,7 +1618,7 @@
           <w:szCs w:val="20"/>
           <w:color w:val="595959"/>
         </w:rPr>
-        <w:t xml:space="preserve">Built for individual producing agents and aspiring/new team leaders. Sequence: quick open-house recap → the growth decision → what broke → the fix (systems) → the fix (culture/people) → the contrarian take → staying a producer while leading.</w:t>
+        <w:t xml:space="preserve">Built for individual producing agents and aspiring/new team leaders. Sequence: quick open-house recap → the growth high → the collapse → the rebuild (systems) → the rebuild (culture/people) → the contrarian take → staying a producer while leading. It’s a rise-fall-rise — let the fall breathe before rushing to the lesson.</w:t>
       </w:r>
     </w:p>
     <w:p>
@@ -1686,7 +1731,7 @@
           <w:sz w:val="21"/>
           <w:szCs w:val="21"/>
         </w:rPr>
-        <w:t xml:space="preserve">Here’s what we didn’t talk about last time. While you were running those open houses, your team was exploding — from about five agents to nearly forty in roughly a year. Take me back to that stretch. What did growth feel like from the inside before you realized it was a problem?</w:t>
+        <w:t xml:space="preserve">Now here’s the story I don’t think you’ve ever told on this show. Before all the open-house success, you helped grow this team from about five agents to nearly forty — and at one point you added something like twenty-five agents in two weeks. Take me back to that stretch. Did it feel like you’d cracked the code?</w:t>
       </w:r>
     </w:p>
     <w:p>
@@ -1709,7 +1754,7 @@
           <w:sz w:val="20"/>
           <w:szCs w:val="20"/>
         </w:rPr>
-        <w:t xml:space="preserve">What’s the specific moment you thought ‘this is working’ — right before it stopped working?</w:t>
+        <w:t xml:space="preserve">Take me to the day you brought that big group on — what did you tell yourself it meant?</w:t>
       </w:r>
     </w:p>
     <w:p>
@@ -1733,7 +1778,7 @@
           <w:szCs w:val="20"/>
           <w:color w:val="595959"/>
         </w:rPr>
-        <w:t xml:space="preserve">The emotional arc + the false summit of fast growth. Sets the stakes for the whole episode.</w:t>
+        <w:t xml:space="preserve">The euphoria / false summit of fast growth. Sets the emotional high before the fall.</w:t>
       </w:r>
     </w:p>
     <w:p>
@@ -1778,7 +1823,7 @@
           <w:sz w:val="21"/>
           <w:szCs w:val="21"/>
         </w:rPr>
-        <w:t xml:space="preserve">When does fast growth actually start to hurt? Give me the thing that broke first — the system, the cash, the culture, you personally. What cracked?</w:t>
+        <w:t xml:space="preserve">And then it came apart. You’ve said the team eventually collapsed all the way back down to about six agents. I want to sit in that for a second — what actually happened? What was the first thing that broke?</w:t>
       </w:r>
     </w:p>
     <w:p>
@@ -1801,7 +1846,7 @@
           <w:sz w:val="20"/>
           <w:szCs w:val="20"/>
         </w:rPr>
-        <w:t xml:space="preserve">Name the first thing that fell over — was it onboarding, accountability, your own bandwidth?</w:t>
+        <w:t xml:space="preserve">Take me to the moment you knew this wasn’t working — what were the warning signs you blew past?</w:t>
       </w:r>
     </w:p>
     <w:p>
@@ -1825,7 +1870,7 @@
           <w:szCs w:val="20"/>
           <w:color w:val="595959"/>
         </w:rPr>
-        <w:t xml:space="preserve">The concrete failure point of scaling. This is the meat — the part nobody tells you.</w:t>
+        <w:t xml:space="preserve">The concrete failure point + the gut-punch of unwinding it. The emotional low of the episode — don’t rush it.</w:t>
       </w:r>
     </w:p>
     <w:p>
@@ -1849,6 +1894,190 @@
           <w:szCs w:val="20"/>
           <w:color w:val="595959"/>
         </w:rPr>
+        <w:t xml:space="preserve">Team leaders, broker-owners, anyone who’s scaled anything.</w:t>
+      </w:r>
+    </w:p>
+    <w:p>
+      <w:pPr>
+        <w:spacing w:before="0" w:after="30"/>
+      </w:pPr>
+      <w:r>
+        <w:rPr>
+          <w:b/>
+          <w:sz w:val="21"/>
+          <w:szCs w:val="21"/>
+          <w:color w:val="1F3864"/>
+        </w:rPr>
+        <w:t xml:space="preserve">4. </w:t>
+      </w:r>
+      <w:r>
+        <w:rPr>
+          <w:sz w:val="21"/>
+          <w:szCs w:val="21"/>
+        </w:rPr>
+        <w:t xml:space="preserve">Going from nearly forty back down to six has to be humbling. When you decided to rebuild, you’ve said you basically started from the ground up — no real tracking, no accountability, no repeatable process the first time. What was the very first system you put in the second time around?</w:t>
+      </w:r>
+    </w:p>
+    <w:p>
+      <w:pPr>
+        <w:spacing w:before="0" w:after="20"/>
+      </w:pPr>
+      <w:r>
+        <w:rPr>
+          <w:b/>
+          <w:i/>
+          <w:sz w:val="20"/>
+          <w:szCs w:val="20"/>
+          <w:color w:val="2E5496"/>
+        </w:rPr>
+        <w:t xml:space="preserve">If vague: </w:t>
+      </w:r>
+      <w:r>
+        <w:rPr>
+          <w:i/>
+          <w:sz w:val="20"/>
+          <w:szCs w:val="20"/>
+        </w:rPr>
+        <w:t xml:space="preserve">Walk me through it — what does that system actually do on a Monday morning?</w:t>
+      </w:r>
+    </w:p>
+    <w:p>
+      <w:pPr>
+        <w:spacing w:before="0" w:after="20"/>
+      </w:pPr>
+      <w:r>
+        <w:rPr>
+          <w:b/>
+          <w:i/>
+          <w:sz w:val="20"/>
+          <w:szCs w:val="20"/>
+          <w:color w:val="595959"/>
+        </w:rPr>
+        <w:t xml:space="preserve">Reveals: </w:t>
+      </w:r>
+      <w:r>
+        <w:rPr>
+          <w:i/>
+          <w:sz w:val="20"/>
+          <w:szCs w:val="20"/>
+          <w:color w:val="595959"/>
+        </w:rPr>
+        <w:t xml:space="preserve">The first domino of the rebuild — something a listener can copy.</w:t>
+      </w:r>
+    </w:p>
+    <w:p>
+      <w:pPr>
+        <w:spacing w:before="0" w:after="80"/>
+      </w:pPr>
+      <w:r>
+        <w:rPr>
+          <w:b/>
+          <w:i/>
+          <w:sz w:val="20"/>
+          <w:szCs w:val="20"/>
+          <w:color w:val="595959"/>
+        </w:rPr>
+        <w:t xml:space="preserve">Serves: </w:t>
+      </w:r>
+      <w:r>
+        <w:rPr>
+          <w:i/>
+          <w:sz w:val="20"/>
+          <w:szCs w:val="20"/>
+          <w:color w:val="595959"/>
+        </w:rPr>
+        <w:t xml:space="preserve">Team leaders; solo agents building their first hire.</w:t>
+      </w:r>
+    </w:p>
+    <w:p>
+      <w:pPr>
+        <w:spacing w:before="0" w:after="30"/>
+      </w:pPr>
+      <w:r>
+        <w:rPr>
+          <w:b/>
+          <w:sz w:val="21"/>
+          <w:szCs w:val="21"/>
+          <w:color w:val="1F3864"/>
+        </w:rPr>
+        <w:t xml:space="preserve">5. </w:t>
+      </w:r>
+      <w:r>
+        <w:rPr>
+          <w:sz w:val="21"/>
+          <w:szCs w:val="21"/>
+        </w:rPr>
+        <w:t xml:space="preserve">The first time, culture got diluted by all the new people. The second time you scaled back up, you’ve said culture is what actually holds it together — but ‘culture’ is the most overused word in this business. What did you do on purpose, the rebuild, to keep it real as you added people again?</w:t>
+      </w:r>
+    </w:p>
+    <w:p>
+      <w:pPr>
+        <w:spacing w:before="0" w:after="20"/>
+      </w:pPr>
+      <w:r>
+        <w:rPr>
+          <w:b/>
+          <w:i/>
+          <w:sz w:val="20"/>
+          <w:szCs w:val="20"/>
+          <w:color w:val="2E5496"/>
+        </w:rPr>
+        <w:t xml:space="preserve">If vague: </w:t>
+      </w:r>
+      <w:r>
+        <w:rPr>
+          <w:i/>
+          <w:sz w:val="20"/>
+          <w:szCs w:val="20"/>
+        </w:rPr>
+        <w:t xml:space="preserve">Give me one specific ritual or standard that protects the culture — not a poster on the wall.</w:t>
+      </w:r>
+    </w:p>
+    <w:p>
+      <w:pPr>
+        <w:spacing w:before="0" w:after="20"/>
+      </w:pPr>
+      <w:r>
+        <w:rPr>
+          <w:b/>
+          <w:i/>
+          <w:sz w:val="20"/>
+          <w:szCs w:val="20"/>
+          <w:color w:val="595959"/>
+        </w:rPr>
+        <w:t xml:space="preserve">Reveals: </w:t>
+      </w:r>
+      <w:r>
+        <w:rPr>
+          <w:i/>
+          <w:sz w:val="20"/>
+          <w:szCs w:val="20"/>
+          <w:color w:val="595959"/>
+        </w:rPr>
+        <w:t xml:space="preserve">How culture is engineered, not hoped for. Differentiates him from every ‘we have great culture’ cliche.</w:t>
+      </w:r>
+    </w:p>
+    <w:p>
+      <w:pPr>
+        <w:spacing w:before="0" w:after="80"/>
+      </w:pPr>
+      <w:r>
+        <w:rPr>
+          <w:b/>
+          <w:i/>
+          <w:sz w:val="20"/>
+          <w:szCs w:val="20"/>
+          <w:color w:val="595959"/>
+        </w:rPr>
+        <w:t xml:space="preserve">Serves: </w:t>
+      </w:r>
+      <w:r>
+        <w:rPr>
+          <w:i/>
+          <w:sz w:val="20"/>
+          <w:szCs w:val="20"/>
+          <w:color w:val="595959"/>
+        </w:rPr>
         <w:t xml:space="preserve">Team leaders, broker-owners.</w:t>
       </w:r>
     </w:p>
@@ -1863,14 +2092,14 @@
           <w:szCs w:val="21"/>
           <w:color w:val="1F3864"/>
         </w:rPr>
-        <w:t xml:space="preserve">4. </w:t>
-      </w:r>
-      <w:r>
-        <w:rPr>
-          <w:sz w:val="21"/>
-          <w:szCs w:val="21"/>
-        </w:rPr>
-        <w:t xml:space="preserve">A lot of leaders would’ve just kept hiring through the pain. You stopped and rebuilt the systems. What was the first system you put in — the one that, if you’d had it six months earlier, would’ve saved you the most pain?</w:t>
+        <w:t xml:space="preserve">6. </w:t>
+      </w:r>
+      <w:r>
+        <w:rPr>
+          <w:sz w:val="21"/>
+          <w:szCs w:val="21"/>
+        </w:rPr>
+        <w:t xml:space="preserve">How do you keep a team this size actually prospecting? You personally held yourself to 100,000 calls a year — but you can’t will that onto forty people. What does accountability look like now so the activity doesn’t quietly collapse the second you stop watching?</w:t>
       </w:r>
     </w:p>
     <w:p>
@@ -1893,7 +2122,7 @@
           <w:sz w:val="20"/>
           <w:szCs w:val="20"/>
         </w:rPr>
-        <w:t xml:space="preserve">Walk me through it — what does that system actually do on a Monday morning?</w:t>
+        <w:t xml:space="preserve">What’s the number every agent has to hit, and what happens when they don’t?</w:t>
       </w:r>
     </w:p>
     <w:p>
@@ -1917,7 +2146,7 @@
           <w:szCs w:val="20"/>
           <w:color w:val="595959"/>
         </w:rPr>
-        <w:t xml:space="preserve">The first domino of the rebuild — something a listener can copy.</w:t>
+        <w:t xml:space="preserve">His accountability machine + how ‘Fam Camp’ turns a top producer’s habits into a team standard.</w:t>
       </w:r>
     </w:p>
     <w:p>
@@ -1941,7 +2170,7 @@
           <w:szCs w:val="20"/>
           <w:color w:val="595959"/>
         </w:rPr>
-        <w:t xml:space="preserve">Team leaders; solo agents building their first hire.</w:t>
+        <w:t xml:space="preserve">Team leaders, individual agents (the discipline ports down to one person).</w:t>
       </w:r>
     </w:p>
     <w:p>
@@ -1955,190 +2184,6 @@
           <w:szCs w:val="21"/>
           <w:color w:val="1F3864"/>
         </w:rPr>
-        <w:t xml:space="preserve">5. </w:t>
-      </w:r>
-      <w:r>
-        <w:rPr>
-          <w:sz w:val="21"/>
-          <w:szCs w:val="21"/>
-        </w:rPr>
-        <w:t xml:space="preserve">You’ve said the thing that holds a growing team together isn’t systems — it’s culture. But ‘culture’ is the most overused word in this business. When you went from five to forty, what did you have to do on purpose to keep the culture from getting diluted by all the new people?</w:t>
-      </w:r>
-    </w:p>
-    <w:p>
-      <w:pPr>
-        <w:spacing w:before="0" w:after="20"/>
-      </w:pPr>
-      <w:r>
-        <w:rPr>
-          <w:b/>
-          <w:i/>
-          <w:sz w:val="20"/>
-          <w:szCs w:val="20"/>
-          <w:color w:val="2E5496"/>
-        </w:rPr>
-        <w:t xml:space="preserve">If vague: </w:t>
-      </w:r>
-      <w:r>
-        <w:rPr>
-          <w:i/>
-          <w:sz w:val="20"/>
-          <w:szCs w:val="20"/>
-        </w:rPr>
-        <w:t xml:space="preserve">Give me one specific ritual or standard that protects the culture — not a poster on the wall.</w:t>
-      </w:r>
-    </w:p>
-    <w:p>
-      <w:pPr>
-        <w:spacing w:before="0" w:after="20"/>
-      </w:pPr>
-      <w:r>
-        <w:rPr>
-          <w:b/>
-          <w:i/>
-          <w:sz w:val="20"/>
-          <w:szCs w:val="20"/>
-          <w:color w:val="595959"/>
-        </w:rPr>
-        <w:t xml:space="preserve">Reveals: </w:t>
-      </w:r>
-      <w:r>
-        <w:rPr>
-          <w:i/>
-          <w:sz w:val="20"/>
-          <w:szCs w:val="20"/>
-          <w:color w:val="595959"/>
-        </w:rPr>
-        <w:t xml:space="preserve">How culture is engineered, not hoped for. Differentiates him from every ‘we have great culture’ cliche.</w:t>
-      </w:r>
-    </w:p>
-    <w:p>
-      <w:pPr>
-        <w:spacing w:before="0" w:after="80"/>
-      </w:pPr>
-      <w:r>
-        <w:rPr>
-          <w:b/>
-          <w:i/>
-          <w:sz w:val="20"/>
-          <w:szCs w:val="20"/>
-          <w:color w:val="595959"/>
-        </w:rPr>
-        <w:t xml:space="preserve">Serves: </w:t>
-      </w:r>
-      <w:r>
-        <w:rPr>
-          <w:i/>
-          <w:sz w:val="20"/>
-          <w:szCs w:val="20"/>
-          <w:color w:val="595959"/>
-        </w:rPr>
-        <w:t xml:space="preserve">Team leaders, broker-owners.</w:t>
-      </w:r>
-    </w:p>
-    <w:p>
-      <w:pPr>
-        <w:spacing w:before="0" w:after="30"/>
-      </w:pPr>
-      <w:r>
-        <w:rPr>
-          <w:b/>
-          <w:sz w:val="21"/>
-          <w:szCs w:val="21"/>
-          <w:color w:val="1F3864"/>
-        </w:rPr>
-        <w:t xml:space="preserve">6. </w:t>
-      </w:r>
-      <w:r>
-        <w:rPr>
-          <w:sz w:val="21"/>
-          <w:szCs w:val="21"/>
-        </w:rPr>
-        <w:t xml:space="preserve">How do you keep forty agents actually prospecting? You personally made 100,000 calls a year — but you can’t will that onto a team. What does accountability look like at FAM so the activity doesn’t collapse the second you stop watching?</w:t>
-      </w:r>
-    </w:p>
-    <w:p>
-      <w:pPr>
-        <w:spacing w:before="0" w:after="20"/>
-      </w:pPr>
-      <w:r>
-        <w:rPr>
-          <w:b/>
-          <w:i/>
-          <w:sz w:val="20"/>
-          <w:szCs w:val="20"/>
-          <w:color w:val="2E5496"/>
-        </w:rPr>
-        <w:t xml:space="preserve">If vague: </w:t>
-      </w:r>
-      <w:r>
-        <w:rPr>
-          <w:i/>
-          <w:sz w:val="20"/>
-          <w:szCs w:val="20"/>
-        </w:rPr>
-        <w:t xml:space="preserve">What’s the number every agent has to hit, and what happens when they don’t?</w:t>
-      </w:r>
-    </w:p>
-    <w:p>
-      <w:pPr>
-        <w:spacing w:before="0" w:after="20"/>
-      </w:pPr>
-      <w:r>
-        <w:rPr>
-          <w:b/>
-          <w:i/>
-          <w:sz w:val="20"/>
-          <w:szCs w:val="20"/>
-          <w:color w:val="595959"/>
-        </w:rPr>
-        <w:t xml:space="preserve">Reveals: </w:t>
-      </w:r>
-      <w:r>
-        <w:rPr>
-          <w:i/>
-          <w:sz w:val="20"/>
-          <w:szCs w:val="20"/>
-          <w:color w:val="595959"/>
-        </w:rPr>
-        <w:t xml:space="preserve">His accountability machine + how ‘Fam Camp’ turns a top producer’s habits into a team standard.</w:t>
-      </w:r>
-    </w:p>
-    <w:p>
-      <w:pPr>
-        <w:spacing w:before="0" w:after="80"/>
-      </w:pPr>
-      <w:r>
-        <w:rPr>
-          <w:b/>
-          <w:i/>
-          <w:sz w:val="20"/>
-          <w:szCs w:val="20"/>
-          <w:color w:val="595959"/>
-        </w:rPr>
-        <w:t xml:space="preserve">Serves: </w:t>
-      </w:r>
-      <w:r>
-        <w:rPr>
-          <w:i/>
-          <w:sz w:val="20"/>
-          <w:szCs w:val="20"/>
-          <w:color w:val="595959"/>
-        </w:rPr>
-        <w:t xml:space="preserve">Team leaders, individual agents (the discipline ports down to one person).</w:t>
-      </w:r>
-    </w:p>
-    <w:p>
-      <w:pPr>
-        <w:spacing w:before="0" w:after="30"/>
-      </w:pPr>
-      <w:r>
-        <w:rPr>
-          <w:b/>
-          <w:sz w:val="21"/>
-          <w:szCs w:val="21"/>
-          <w:color w:val="1F3864"/>
-        </w:rPr>
         <w:t xml:space="preserve">7. </w:t>
       </w:r>
       <w:r>
@@ -2146,7 +2191,7 @@
           <w:sz w:val="21"/>
           <w:szCs w:val="21"/>
         </w:rPr>
-        <w:t xml:space="preserve">I’ve interviewed hundreds of agents on this show, and almost every one thinks the dream is a big team. You built one fast and you’ve said it almost broke you. So what does nobody tell you about growing before you’re ready — and how does an agent know if they should even build a team at all?</w:t>
+        <w:t xml:space="preserve">I’ve interviewed hundreds of agents on this show, and almost every one thinks the dream is a bigger team. You added twenty-five agents in two weeks and watched it collapse back to six. So what does nobody tell you about growing before you’re ready — and how does an agent know if they should even build a team at all?</w:t>
       </w:r>
     </w:p>
     <w:p>
@@ -2936,7 +2981,27 @@
           <w:sz w:val="21"/>
           <w:szCs w:val="21"/>
         </w:rPr>
-        <w:t xml:space="preserve">GRIT podcast (Sisu), Ep. 145: “When Growth Hurts: How Zach Geisendorfer Recovered From Rapid Expansion” — FAM grew from ~5 to ~40 agents in Orange County; he discusses the ups and downs of fast growth and the need for solid systems and strong team culture. This is the spine of the new episode.</w:t>
+        <w:t xml:space="preserve">GRIT podcast (Sisu), Ep. 145: “When Growth Hurts: How Zach Geisendorfer Recovered From Rapid Expansion” — aired 9/4/2024. The growth-and-collapse story PREDATES his April 2025 KIR appearance; treat it as backstory, not current events. This is the spine of the new episode.</w:t>
+      </w:r>
+    </w:p>
+    <w:p>
+      <w:pPr>
+        <w:spacing w:before="0" w:after="50"/>
+      </w:pPr>
+      <w:r>
+        <w:rPr>
+          <w:sz w:val="21"/>
+          <w:szCs w:val="21"/>
+          <w:color w:val="2E5496"/>
+        </w:rPr>
+        <w:t xml:space="preserve">•  </w:t>
+      </w:r>
+      <w:r>
+        <w:rPr>
+          <w:sz w:val="21"/>
+          <w:szCs w:val="21"/>
+        </w:rPr>
+        <w:t xml:space="preserve">The arc (from the GRIT episode): grew from ~5 agents toward ~40 in Orange County, added ~25 agents in ~2 weeks, then “without a solid system, things fell apart fast” and the team contracted back to ~6 agents; they had no tracking/accountability/replicable process, so they rebuilt from the ground up.</w:t>
       </w:r>
     </w:p>
     <w:p>
@@ -2990,6 +3055,46 @@
           <w:sz w:val="21"/>
           <w:szCs w:val="21"/>
         </w:rPr>
+        <w:t xml:space="preserve">The exact growth figures (“~25 agents in 2 weeks,” “back to ~6”) are paraphrased from the GRIT episode write-up, not timed from the audio. Use them, but follow his lead if he states them differently on air.</w:t>
+      </w:r>
+    </w:p>
+    <w:p>
+      <w:pPr>
+        <w:spacing w:before="0" w:after="50"/>
+      </w:pPr>
+      <w:r>
+        <w:rPr>
+          <w:sz w:val="21"/>
+          <w:szCs w:val="21"/>
+          <w:color w:val="2E5496"/>
+        </w:rPr>
+        <w:t xml:space="preserve">•  </w:t>
+      </w:r>
+      <w:r>
+        <w:rPr>
+          <w:sz w:val="21"/>
+          <w:szCs w:val="21"/>
+        </w:rPr>
+        <w:t xml:space="preserve">Where the team stands TODAY (size, deal count) — confirm. The episode needs a clean ‘and now we’re here’ comeback payoff before the close.</w:t>
+      </w:r>
+    </w:p>
+    <w:p>
+      <w:pPr>
+        <w:spacing w:before="0" w:after="50"/>
+      </w:pPr>
+      <w:r>
+        <w:rPr>
+          <w:sz w:val="21"/>
+          <w:szCs w:val="21"/>
+          <w:color w:val="2E5496"/>
+        </w:rPr>
+        <w:t xml:space="preserve">•  </w:t>
+      </w:r>
+      <w:r>
+        <w:rPr>
+          <w:sz w:val="21"/>
+          <w:szCs w:val="21"/>
+        </w:rPr>
         <w:t xml:space="preserve">~600,000 calls over ~5 years / ~100,000 per year (his own figure on KIR).</w:t>
       </w:r>
     </w:p>
@@ -3182,7 +3287,7 @@
           <w:sz w:val="21"/>
           <w:szCs w:val="21"/>
         </w:rPr>
-        <w:t xml:space="preserve">• GRIT podcast (Sisu) Ep. 145: blog.sisu.co/episode-145-zach-geisendorfer</w:t>
+        <w:t xml:space="preserve">• GRIT podcast (Sisu) Ep. 145, aired 9/4/2024: blog.sisu.co/episode-145-zach-geisendorfer (video: youtube.com/watch?v=lZDK7QaosPA)</w:t>
       </w:r>
     </w:p>
     <w:p>

</xml_diff>

<commit_message>
Add launch-day social posts (FB/LI/YT) to Zach Geisendorfer prep
Paste-ready titles + descriptions for when the episode publishes, with Zach's
handles built in for tagging. Published voice rules applied (no em-dashes,
straight quotes, contractions).

Co-Authored-By: Claude Opus 4.8 (1M context) <noreply@anthropic.com>
</commit_message>
<xml_diff>
--- a/guest-prep/Zach_Geisendorfer_Interview_Prep.docx
+++ b/guest-prep/Zach_Geisendorfer_Interview_Prep.docx
@@ -3338,6 +3338,456 @@
         <w:t xml:space="preserve">• Market context: pamfraser.com / mylenemerlo.com / sandiegorealestatehunter.com (North County San Diego, 2026); NAR settlement buyer-agreement rules (Aug 17, 2024).</w:t>
       </w:r>
     </w:p>
+    <w:p>
+      <w:pPr>
+        <w:spacing w:before="240" w:after="120"/>
+        <w:shd w:val="clear" w:fill="1F3864"/>
+      </w:pPr>
+      <w:r>
+        <w:rPr>
+          <w:b/>
+          <w:caps/>
+          <w:sz w:val="26"/>
+          <w:szCs w:val="26"/>
+          <w:color w:val="FFFFFF"/>
+        </w:rPr>
+        <w:t xml:space="preserve">Section 5  —  Launch-Day Social Posts (FB / LI / YT)</w:t>
+      </w:r>
+    </w:p>
+    <w:p>
+      <w:pPr>
+        <w:spacing w:before="0" w:after="100"/>
+      </w:pPr>
+      <w:r>
+        <w:rPr>
+          <w:i/>
+          <w:sz w:val="19"/>
+          <w:szCs w:val="19"/>
+          <w:color w:val="595959"/>
+        </w:rPr>
+        <w:t xml:space="preserve">Paste-ready promo copy for when the episode publishes. Published copy in D.J.'s voice — straight quotes, no em-dashes, contractions on, no AI-speak. Zach's handles are built in for tagging.</w:t>
+      </w:r>
+    </w:p>
+    <w:p>
+      <w:pPr>
+        <w:spacing w:before="140" w:after="40"/>
+      </w:pPr>
+      <w:r>
+        <w:rPr>
+          <w:b/>
+          <w:sz w:val="22"/>
+          <w:szCs w:val="22"/>
+          <w:color w:val="2E5496"/>
+        </w:rPr>
+        <w:t xml:space="preserve">YouTube</w:t>
+      </w:r>
+    </w:p>
+    <w:p>
+      <w:pPr>
+        <w:spacing w:before="0" w:after="30"/>
+      </w:pPr>
+      <w:r>
+        <w:rPr>
+          <w:b/>
+          <w:sz w:val="21"/>
+          <w:szCs w:val="21"/>
+          <w:color w:val="1F3864"/>
+        </w:rPr>
+        <w:t xml:space="preserve">Title (primary): </w:t>
+      </w:r>
+      <w:r>
+        <w:rPr>
+          <w:sz w:val="21"/>
+          <w:szCs w:val="21"/>
+        </w:rPr>
+        <w:t xml:space="preserve">He Added 25 Agents in Two Weeks. Then It All Collapsed. | Zach Geisendorfer</w:t>
+      </w:r>
+    </w:p>
+    <w:p>
+      <w:pPr>
+        <w:spacing w:before="0" w:after="40"/>
+      </w:pPr>
+      <w:r>
+        <w:rPr>
+          <w:b/>
+          <w:sz w:val="21"/>
+          <w:szCs w:val="21"/>
+          <w:color w:val="1F3864"/>
+        </w:rPr>
+        <w:t xml:space="preserve">Title (alt): </w:t>
+      </w:r>
+      <w:r>
+        <w:rPr>
+          <w:sz w:val="21"/>
+          <w:szCs w:val="21"/>
+        </w:rPr>
+        <w:t xml:space="preserve">How to Grow a Real Estate Team Without It Blowing Up | Zach Geisendorfer</w:t>
+      </w:r>
+    </w:p>
+    <w:p>
+      <w:pPr>
+        <w:spacing w:before="0" w:after="20"/>
+      </w:pPr>
+      <w:r>
+        <w:rPr>
+          <w:b/>
+          <w:sz w:val="21"/>
+          <w:szCs w:val="21"/>
+          <w:color w:val="1F3864"/>
+        </w:rPr>
+        <w:t xml:space="preserve">Description:</w:t>
+      </w:r>
+    </w:p>
+    <w:p>
+      <w:pPr>
+        <w:spacing w:before="0" w:after="40"/>
+      </w:pPr>
+      <w:r>
+        <w:rPr>
+          <w:sz w:val="21"/>
+          <w:szCs w:val="21"/>
+        </w:rPr>
+        <w:t xml:space="preserve">Zach Geisendorfer helped grow a real estate team from 5 agents to nearly 40, added 25 of them in a single two week stretch, and then watched the whole thing fall apart and shrink back down to 6. In this episode he tells the story he's never told on this show: what actually breaks when you grow too fast, the systems and culture he rebuilt with, and how he came back stronger. He also gives the quick version of the mega open house strategy that prints business for his agents.</w:t>
+      </w:r>
+    </w:p>
+    <w:p>
+      <w:pPr>
+        <w:spacing w:before="0" w:after="20"/>
+      </w:pPr>
+      <w:r>
+        <w:rPr>
+          <w:sz w:val="21"/>
+          <w:szCs w:val="21"/>
+        </w:rPr>
+        <w:t xml:space="preserve">In this episode:</w:t>
+      </w:r>
+    </w:p>
+    <w:p>
+      <w:pPr>
+        <w:spacing w:before="0" w:after="10"/>
+      </w:pPr>
+      <w:r>
+        <w:rPr>
+          <w:sz w:val="21"/>
+          <w:szCs w:val="21"/>
+        </w:rPr>
+        <w:t xml:space="preserve">- Why adding 25 agents in two weeks nearly destroyed the team</w:t>
+      </w:r>
+    </w:p>
+    <w:p>
+      <w:pPr>
+        <w:spacing w:before="0" w:after="10"/>
+      </w:pPr>
+      <w:r>
+        <w:rPr>
+          <w:sz w:val="21"/>
+          <w:szCs w:val="21"/>
+        </w:rPr>
+        <w:t xml:space="preserve">- The first system he installed when he rebuilt from scratch</w:t>
+      </w:r>
+    </w:p>
+    <w:p>
+      <w:pPr>
+        <w:spacing w:before="0" w:after="10"/>
+      </w:pPr>
+      <w:r>
+        <w:rPr>
+          <w:sz w:val="21"/>
+          <w:szCs w:val="21"/>
+        </w:rPr>
+        <w:t xml:space="preserve">- How he keeps a whole team actually prospecting</w:t>
+      </w:r>
+    </w:p>
+    <w:p>
+      <w:pPr>
+        <w:spacing w:before="0" w:after="40"/>
+      </w:pPr>
+      <w:r>
+        <w:rPr>
+          <w:sz w:val="21"/>
+          <w:szCs w:val="21"/>
+        </w:rPr>
+        <w:t xml:space="preserve">- The 60 second version of his mega open house playbook</w:t>
+      </w:r>
+    </w:p>
+    <w:p>
+      <w:pPr>
+        <w:spacing w:before="0" w:after="10"/>
+      </w:pPr>
+      <w:r>
+        <w:rPr>
+          <w:sz w:val="21"/>
+          <w:szCs w:val="21"/>
+        </w:rPr>
+        <w:t xml:space="preserve">Connect with Zach Geisendorfer:</w:t>
+      </w:r>
+    </w:p>
+    <w:p>
+      <w:pPr>
+        <w:spacing w:before="0" w:after="10"/>
+      </w:pPr>
+      <w:r>
+        <w:rPr>
+          <w:sz w:val="21"/>
+          <w:szCs w:val="21"/>
+        </w:rPr>
+        <w:t xml:space="preserve">Instagram: @zachzenrealestate</w:t>
+      </w:r>
+    </w:p>
+    <w:p>
+      <w:pPr>
+        <w:spacing w:before="0" w:after="10"/>
+      </w:pPr>
+      <w:r>
+        <w:rPr>
+          <w:sz w:val="21"/>
+          <w:szCs w:val="21"/>
+        </w:rPr>
+        <w:t xml:space="preserve">Web: famrealtygroup.com</w:t>
+      </w:r>
+    </w:p>
+    <w:p>
+      <w:pPr>
+        <w:spacing w:before="0" w:after="40"/>
+      </w:pPr>
+      <w:r>
+        <w:rPr>
+          <w:sz w:val="21"/>
+          <w:szCs w:val="21"/>
+        </w:rPr>
+        <w:t xml:space="preserve">LinkedIn: search Zach Geisendorfer</w:t>
+      </w:r>
+    </w:p>
+    <w:p>
+      <w:pPr>
+        <w:spacing w:before="0" w:after="40"/>
+      </w:pPr>
+      <w:r>
+        <w:rPr>
+          <w:sz w:val="21"/>
+          <w:szCs w:val="21"/>
+        </w:rPr>
+        <w:t xml:space="preserve">Keeping It Real is the largest podcast made by real estate agents, for real estate agents, hosted by D.J. Paris. New episodes every week. Subscribe so you never miss one.</w:t>
+      </w:r>
+    </w:p>
+    <w:p>
+      <w:pPr>
+        <w:spacing w:before="0" w:after="80"/>
+      </w:pPr>
+      <w:r>
+        <w:rPr>
+          <w:sz w:val="21"/>
+          <w:szCs w:val="21"/>
+        </w:rPr>
+        <w:t xml:space="preserve">#realestate #realestateagent #realestatecoaching #realestateteam #openhouse #realestatepodcast</w:t>
+      </w:r>
+    </w:p>
+    <w:p>
+      <w:pPr>
+        <w:spacing w:before="140" w:after="40"/>
+      </w:pPr>
+      <w:r>
+        <w:rPr>
+          <w:b/>
+          <w:sz w:val="22"/>
+          <w:szCs w:val="22"/>
+          <w:color w:val="2E5496"/>
+        </w:rPr>
+        <w:t xml:space="preserve">Facebook</w:t>
+      </w:r>
+    </w:p>
+    <w:p>
+      <w:pPr>
+        <w:spacing w:before="0" w:after="30"/>
+      </w:pPr>
+      <w:r>
+        <w:rPr>
+          <w:b/>
+          <w:sz w:val="21"/>
+          <w:szCs w:val="21"/>
+          <w:color w:val="1F3864"/>
+        </w:rPr>
+        <w:t xml:space="preserve">Hook: </w:t>
+      </w:r>
+      <w:r>
+        <w:rPr>
+          <w:sz w:val="21"/>
+          <w:szCs w:val="21"/>
+        </w:rPr>
+        <w:t xml:space="preserve">Most agents think the dream is a bigger team. Zach proved how fast that can backfire.</w:t>
+      </w:r>
+    </w:p>
+    <w:p>
+      <w:pPr>
+        <w:spacing w:before="0" w:after="20"/>
+      </w:pPr>
+      <w:r>
+        <w:rPr>
+          <w:b/>
+          <w:sz w:val="21"/>
+          <w:szCs w:val="21"/>
+          <w:color w:val="1F3864"/>
+        </w:rPr>
+        <w:t xml:space="preserve">Post:</w:t>
+      </w:r>
+    </w:p>
+    <w:p>
+      <w:pPr>
+        <w:spacing w:before="0" w:after="30"/>
+      </w:pPr>
+      <w:r>
+        <w:rPr>
+          <w:sz w:val="21"/>
+          <w:szCs w:val="21"/>
+        </w:rPr>
+        <w:t xml:space="preserve">Most agents think the dream is a bigger team. Zach Geisendorfer built one fast, added 25 agents in two weeks, and then watched it collapse all the way back down to 6.</w:t>
+      </w:r>
+    </w:p>
+    <w:p>
+      <w:pPr>
+        <w:spacing w:before="0" w:after="30"/>
+      </w:pPr>
+      <w:r>
+        <w:rPr>
+          <w:sz w:val="21"/>
+          <w:szCs w:val="21"/>
+        </w:rPr>
+        <w:t xml:space="preserve">This week he's back on Keeping It Real to tell the story he's never told here before. What breaks when you grow too fast, and exactly how he rebuilt. If you've ever wanted to scale your business, start with this one.</w:t>
+      </w:r>
+    </w:p>
+    <w:p>
+      <w:pPr>
+        <w:spacing w:before="0" w:after="30"/>
+      </w:pPr>
+      <w:r>
+        <w:rPr>
+          <w:sz w:val="21"/>
+          <w:szCs w:val="21"/>
+        </w:rPr>
+        <w:t xml:space="preserve">Follow Zach at @zachzenrealestate on Instagram and over at famrealtygroup.com. Listen now at the link below.</w:t>
+      </w:r>
+    </w:p>
+    <w:p>
+      <w:pPr>
+        <w:spacing w:before="0" w:after="80"/>
+      </w:pPr>
+      <w:r>
+        <w:rPr>
+          <w:sz w:val="21"/>
+          <w:szCs w:val="21"/>
+        </w:rPr>
+        <w:t xml:space="preserve">#realestate #realestateagent #realestatepodcast #teambuilding</w:t>
+      </w:r>
+    </w:p>
+    <w:p>
+      <w:pPr>
+        <w:spacing w:before="140" w:after="40"/>
+      </w:pPr>
+      <w:r>
+        <w:rPr>
+          <w:b/>
+          <w:sz w:val="22"/>
+          <w:szCs w:val="22"/>
+          <w:color w:val="2E5496"/>
+        </w:rPr>
+        <w:t xml:space="preserve">LinkedIn</w:t>
+      </w:r>
+    </w:p>
+    <w:p>
+      <w:pPr>
+        <w:spacing w:before="0" w:after="30"/>
+      </w:pPr>
+      <w:r>
+        <w:rPr>
+          <w:b/>
+          <w:sz w:val="21"/>
+          <w:szCs w:val="21"/>
+          <w:color w:val="1F3864"/>
+        </w:rPr>
+        <w:t xml:space="preserve">Hook: </w:t>
+      </w:r>
+      <w:r>
+        <w:rPr>
+          <w:sz w:val="21"/>
+          <w:szCs w:val="21"/>
+        </w:rPr>
+        <w:t xml:space="preserve">Growth isn't the goal. Survivable growth is.</w:t>
+      </w:r>
+    </w:p>
+    <w:p>
+      <w:pPr>
+        <w:spacing w:before="0" w:after="20"/>
+      </w:pPr>
+      <w:r>
+        <w:rPr>
+          <w:b/>
+          <w:sz w:val="21"/>
+          <w:szCs w:val="21"/>
+          <w:color w:val="1F3864"/>
+        </w:rPr>
+        <w:t xml:space="preserve">Post:</w:t>
+      </w:r>
+    </w:p>
+    <w:p>
+      <w:pPr>
+        <w:spacing w:before="0" w:after="30"/>
+      </w:pPr>
+      <w:r>
+        <w:rPr>
+          <w:sz w:val="21"/>
+          <w:szCs w:val="21"/>
+        </w:rPr>
+        <w:t xml:space="preserve">Growth isn't the goal. Survivable growth is.</w:t>
+      </w:r>
+    </w:p>
+    <w:p>
+      <w:pPr>
+        <w:spacing w:before="0" w:after="30"/>
+      </w:pPr>
+      <w:r>
+        <w:rPr>
+          <w:sz w:val="21"/>
+          <w:szCs w:val="21"/>
+        </w:rPr>
+        <w:t xml:space="preserve">Zach Geisendorfer helped scale a real estate team to nearly 40 agents, added 25 in two weeks, then watched it contract back to 6 for one simple reason: no systems, no accountability, no repeatable process.</w:t>
+      </w:r>
+    </w:p>
+    <w:p>
+      <w:pPr>
+        <w:spacing w:before="0" w:after="30"/>
+      </w:pPr>
+      <w:r>
+        <w:rPr>
+          <w:sz w:val="21"/>
+          <w:szCs w:val="21"/>
+        </w:rPr>
+        <w:t xml:space="preserve">In this new Keeping It Real episode he walks through the rebuild. The first system he installed. How culture either compounds or breaks as you add people. And how to know whether you should build a team at all. If you lead a team, or you want to, this is the conversation to study.</w:t>
+      </w:r>
+    </w:p>
+    <w:p>
+      <w:pPr>
+        <w:spacing w:before="0" w:after="30"/>
+      </w:pPr>
+      <w:r>
+        <w:rPr>
+          <w:sz w:val="21"/>
+          <w:szCs w:val="21"/>
+        </w:rPr>
+        <w:t xml:space="preserve">Connect with Zach Geisendorfer here on LinkedIn, on Instagram at @zachzenrealestate, or at famrealtygroup.com. Listen at the link in the comments.</w:t>
+      </w:r>
+    </w:p>
+    <w:p>
+      <w:pPr>
+        <w:spacing w:before="0" w:after="80"/>
+      </w:pPr>
+      <w:r>
+        <w:rPr>
+          <w:sz w:val="21"/>
+          <w:szCs w:val="21"/>
+        </w:rPr>
+        <w:t xml:space="preserve">#RealEstate #Leadership #TeamBuilding #RealEstateCoaching</w:t>
+      </w:r>
+    </w:p>
     <w:sectPr>
       <w:pgSz w:w="12240" w:h="15840"/>
       <w:pgMar w:top="900" w:right="900" w:bottom="900" w:left="900" w:header="360" w:footer="360" w:gutter="0"/>

</xml_diff>